<commit_message>
03-28-26 - Update module 1
</commit_message>
<xml_diff>
--- a/worksheets/module_1/csuf_module_1_worksheet_c.docx
+++ b/worksheets/module_1/csuf_module_1_worksheet_c.docx
@@ -209,6 +209,16 @@
     <w:p>
       <w:pPr>
         <w:pStyle w:val="Heading1"/>
+        <w:sectPr>
+          <w:footnotePr>
+            <w:numFmt w:val="chicago"/>
+          </w:footnotePr>
+          <w:type w:val="continuous"/>
+          <w:pgSz w:w="12240" w:h="15840"/>
+          <w:pgMar w:top="1440" w:right="1440" w:bottom="1440" w:left="1440" w:header="720" w:footer="720" w:gutter="0"/>
+          <w:cols w:space="720"/>
+          <w:docGrid w:linePitch="360"/>
+        </w:sectPr>
       </w:pPr>
       <w:r>
         <w:lastRenderedPageBreak/>
@@ -222,6 +232,12 @@
       </w:r>
       <w:r>
         <w:t>Debugging Activity: Fix the Flip-Flop</w:t>
+      </w:r>
+      <w:r>
+        <w:rPr>
+          <w:rStyle w:val="FootnoteReference"/>
+        </w:rPr>
+        <w:footnoteReference w:id="1"/>
       </w:r>
     </w:p>
     <w:p>
@@ -953,6 +969,7 @@
       </w:r>
     </w:p>
     <w:sectPr>
+      <w:type w:val="continuous"/>
       <w:pgSz w:w="12240" w:h="15840"/>
       <w:pgMar w:top="1440" w:right="1440" w:bottom="1440" w:left="1440" w:header="720" w:footer="720" w:gutter="0"/>
       <w:cols w:space="720"/>
@@ -995,6 +1012,38 @@
       <w:r>
         <w:continuationSeparator/>
       </w:r>
+    </w:p>
+  </w:footnote>
+  <w:footnote w:id="1">
+    <w:p>
+      <w:pPr>
+        <w:pStyle w:val="FootnoteText"/>
+      </w:pPr>
+      <w:r>
+        <w:rPr>
+          <w:rStyle w:val="FootnoteReference"/>
+        </w:rPr>
+        <w:footnoteRef/>
+      </w:r>
+      <w:r>
+        <w:t xml:space="preserve"> Source: </w:t>
+      </w:r>
+      <w:hyperlink r:id="rId1" w:history="1">
+        <w:r>
+          <w:rPr>
+            <w:rStyle w:val="Hyperlink"/>
+          </w:rPr>
+          <w:t xml:space="preserve">Tiny </w:t>
+        </w:r>
+        <w:proofErr w:type="spellStart"/>
+        <w:r>
+          <w:rPr>
+            <w:rStyle w:val="Hyperlink"/>
+          </w:rPr>
+          <w:t>Tapeout</w:t>
+        </w:r>
+        <w:proofErr w:type="spellEnd"/>
+      </w:hyperlink>
     </w:p>
   </w:footnote>
 </w:footnotes>
@@ -5919,6 +5968,7 @@
   <w:style w:type="character" w:default="1" w:styleId="DefaultParagraphFont">
     <w:name w:val="Default Paragraph Font"/>
     <w:uiPriority w:val="1"/>
+    <w:semiHidden/>
     <w:unhideWhenUsed/>
   </w:style>
   <w:style w:type="table" w:default="1" w:styleId="TableNormal">

</xml_diff>